<commit_message>
add exercise day 127 hashing
</commit_message>
<xml_diff>
--- a/leetcode/3.Hashing/3.Checking for existence.docx
+++ b/leetcode/3.Hashing/3.Checking for existence.docx
@@ -1424,6 +1424,50 @@
           <w14:ligatures w14:val="none"/>
         </w:rPr>
       </w:pPr>
+      <w:r>
+        <w:rPr>
+          <w:rFonts w:ascii="Segoe UI" w:eastAsia="Times New Roman" w:hAnsi="Segoe UI" w:cs="Segoe UI"/>
+          <w:noProof/>
+          <w:color w:val="5A5A5A"/>
+          <w:kern w:val="0"/>
+          <w14:ligatures w14:val="none"/>
+        </w:rPr>
+        <w:drawing>
+          <wp:inline distT="0" distB="0" distL="0" distR="0" wp14:anchorId="4EB3869D" wp14:editId="43EB08BD">
+            <wp:extent cx="5943600" cy="2799715"/>
+            <wp:effectExtent l="0" t="0" r="0" b="635"/>
+            <wp:docPr id="1566720038" name="Picture 1"/>
+            <wp:cNvGraphicFramePr>
+              <a:graphicFrameLocks xmlns:a="http://schemas.openxmlformats.org/drawingml/2006/main" noChangeAspect="1"/>
+            </wp:cNvGraphicFramePr>
+            <a:graphic xmlns:a="http://schemas.openxmlformats.org/drawingml/2006/main">
+              <a:graphicData uri="http://schemas.openxmlformats.org/drawingml/2006/picture">
+                <pic:pic xmlns:pic="http://schemas.openxmlformats.org/drawingml/2006/picture">
+                  <pic:nvPicPr>
+                    <pic:cNvPr id="1566720038" name=""/>
+                    <pic:cNvPicPr/>
+                  </pic:nvPicPr>
+                  <pic:blipFill>
+                    <a:blip r:embed="rId6"/>
+                    <a:stretch>
+                      <a:fillRect/>
+                    </a:stretch>
+                  </pic:blipFill>
+                  <pic:spPr>
+                    <a:xfrm>
+                      <a:off x="0" y="0"/>
+                      <a:ext cx="5943600" cy="2799715"/>
+                    </a:xfrm>
+                    <a:prstGeom prst="rect">
+                      <a:avLst/>
+                    </a:prstGeom>
+                  </pic:spPr>
+                </pic:pic>
+              </a:graphicData>
+            </a:graphic>
+          </wp:inline>
+        </w:drawing>
+      </w:r>
     </w:p>
     <w:p>
       <w:pPr>
@@ -1666,7 +1710,7 @@
         </w:rPr>
         <w:t>Example 2: </w:t>
       </w:r>
-      <w:hyperlink r:id="rId6" w:tgtFrame="_blank" w:history="1">
+      <w:hyperlink r:id="rId7" w:tgtFrame="_blank" w:history="1">
         <w:r>
           <w:rPr>
             <w:rFonts w:ascii="Segoe UI" w:eastAsia="Times New Roman" w:hAnsi="Segoe UI" w:cs="Segoe UI"/>
@@ -1791,6 +1835,68 @@
           <w14:ligatures w14:val="none"/>
         </w:rPr>
         <w:t> to see if there is any match.</w:t>
+      </w:r>
+    </w:p>
+    <w:p>
+      <w:pPr>
+        <w:pBdr>
+          <w:top w:val="single" w:sz="2" w:space="0" w:color="auto"/>
+          <w:left w:val="single" w:sz="2" w:space="0" w:color="auto"/>
+          <w:bottom w:val="single" w:sz="2" w:space="0" w:color="auto"/>
+          <w:right w:val="single" w:sz="2" w:space="0" w:color="auto"/>
+        </w:pBdr>
+        <w:shd w:val="clear" w:color="auto" w:fill="FFFFFF"/>
+        <w:spacing w:after="240" w:line="240" w:lineRule="auto"/>
+        <w:rPr>
+          <w:rFonts w:ascii="Segoe UI" w:eastAsia="Times New Roman" w:hAnsi="Segoe UI" w:cs="Segoe UI"/>
+          <w:color w:val="5A5A5A"/>
+          <w:kern w:val="0"/>
+          <w14:ligatures w14:val="none"/>
+        </w:rPr>
+      </w:pPr>
+      <w:r>
+        <w:rPr>
+          <w:rFonts w:ascii="Segoe UI" w:eastAsia="Times New Roman" w:hAnsi="Segoe UI" w:cs="Segoe UI"/>
+          <w:color w:val="5A5A5A"/>
+          <w:kern w:val="0"/>
+          <w14:ligatures w14:val="none"/>
+        </w:rPr>
+        <w:lastRenderedPageBreak/>
+        <w:drawing>
+          <wp:inline distT="0" distB="0" distL="0" distR="0" wp14:anchorId="119B33B5" wp14:editId="200006F5">
+            <wp:extent cx="5943600" cy="2458720"/>
+            <wp:effectExtent l="0" t="0" r="0" b="0"/>
+            <wp:docPr id="1160565001" name="Picture 1"/>
+            <wp:cNvGraphicFramePr>
+              <a:graphicFrameLocks xmlns:a="http://schemas.openxmlformats.org/drawingml/2006/main" noChangeAspect="1"/>
+            </wp:cNvGraphicFramePr>
+            <a:graphic xmlns:a="http://schemas.openxmlformats.org/drawingml/2006/main">
+              <a:graphicData uri="http://schemas.openxmlformats.org/drawingml/2006/picture">
+                <pic:pic xmlns:pic="http://schemas.openxmlformats.org/drawingml/2006/picture">
+                  <pic:nvPicPr>
+                    <pic:cNvPr id="1160565001" name=""/>
+                    <pic:cNvPicPr/>
+                  </pic:nvPicPr>
+                  <pic:blipFill>
+                    <a:blip r:embed="rId8"/>
+                    <a:stretch>
+                      <a:fillRect/>
+                    </a:stretch>
+                  </pic:blipFill>
+                  <pic:spPr>
+                    <a:xfrm>
+                      <a:off x="0" y="0"/>
+                      <a:ext cx="5943600" cy="2458720"/>
+                    </a:xfrm>
+                    <a:prstGeom prst="rect">
+                      <a:avLst/>
+                    </a:prstGeom>
+                  </pic:spPr>
+                </pic:pic>
+              </a:graphicData>
+            </a:graphic>
+          </wp:inline>
+        </w:drawing>
       </w:r>
     </w:p>
     <w:p>
@@ -1960,6 +2066,49 @@
           <w14:ligatures w14:val="none"/>
         </w:rPr>
       </w:pPr>
+      <w:r>
+        <w:rPr>
+          <w:rFonts w:ascii="Segoe UI" w:eastAsia="Times New Roman" w:hAnsi="Segoe UI" w:cs="Segoe UI"/>
+          <w:color w:val="5A5A5A"/>
+          <w:kern w:val="0"/>
+          <w14:ligatures w14:val="none"/>
+        </w:rPr>
+        <w:drawing>
+          <wp:inline distT="0" distB="0" distL="0" distR="0" wp14:anchorId="4A52B754" wp14:editId="444B943F">
+            <wp:extent cx="5943600" cy="2407920"/>
+            <wp:effectExtent l="0" t="0" r="0" b="0"/>
+            <wp:docPr id="16583073" name="Picture 1"/>
+            <wp:cNvGraphicFramePr>
+              <a:graphicFrameLocks xmlns:a="http://schemas.openxmlformats.org/drawingml/2006/main" noChangeAspect="1"/>
+            </wp:cNvGraphicFramePr>
+            <a:graphic xmlns:a="http://schemas.openxmlformats.org/drawingml/2006/main">
+              <a:graphicData uri="http://schemas.openxmlformats.org/drawingml/2006/picture">
+                <pic:pic xmlns:pic="http://schemas.openxmlformats.org/drawingml/2006/picture">
+                  <pic:nvPicPr>
+                    <pic:cNvPr id="16583073" name=""/>
+                    <pic:cNvPicPr/>
+                  </pic:nvPicPr>
+                  <pic:blipFill>
+                    <a:blip r:embed="rId9"/>
+                    <a:stretch>
+                      <a:fillRect/>
+                    </a:stretch>
+                  </pic:blipFill>
+                  <pic:spPr>
+                    <a:xfrm>
+                      <a:off x="0" y="0"/>
+                      <a:ext cx="5943600" cy="2407920"/>
+                    </a:xfrm>
+                    <a:prstGeom prst="rect">
+                      <a:avLst/>
+                    </a:prstGeom>
+                  </pic:spPr>
+                </pic:pic>
+              </a:graphicData>
+            </a:graphic>
+          </wp:inline>
+        </w:drawing>
+      </w:r>
     </w:p>
     <w:p>
       <w:pPr>
@@ -2239,6 +2388,7 @@
           <w:kern w:val="0"/>
           <w14:ligatures w14:val="none"/>
         </w:rPr>
+        <w:lastRenderedPageBreak/>
         <w:t>Example 3: Given an integer array </w:t>
       </w:r>
       <w:proofErr w:type="spellStart"/>
@@ -2414,7 +2564,6 @@
           <w:kern w:val="0"/>
           <w14:ligatures w14:val="none"/>
         </w:rPr>
-        <w:lastRenderedPageBreak/>
         <w:t>If a valid number </w:t>
       </w:r>
       <w:r>
@@ -2634,6 +2783,67 @@
           <w14:ligatures w14:val="none"/>
         </w:rPr>
         <w:t>Converting the input into a set beforehand is another example of pre-processing.</w:t>
+      </w:r>
+    </w:p>
+    <w:p>
+      <w:pPr>
+        <w:pBdr>
+          <w:top w:val="single" w:sz="2" w:space="0" w:color="auto"/>
+          <w:left w:val="single" w:sz="2" w:space="0" w:color="auto"/>
+          <w:bottom w:val="single" w:sz="2" w:space="0" w:color="auto"/>
+          <w:right w:val="single" w:sz="2" w:space="0" w:color="auto"/>
+        </w:pBdr>
+        <w:shd w:val="clear" w:color="auto" w:fill="FFFFFF"/>
+        <w:spacing w:after="240" w:line="240" w:lineRule="auto"/>
+        <w:rPr>
+          <w:rFonts w:ascii="Segoe UI" w:eastAsia="Times New Roman" w:hAnsi="Segoe UI" w:cs="Segoe UI"/>
+          <w:color w:val="5A5A5A"/>
+          <w:kern w:val="0"/>
+          <w14:ligatures w14:val="none"/>
+        </w:rPr>
+      </w:pPr>
+      <w:r>
+        <w:rPr>
+          <w:rFonts w:ascii="Segoe UI" w:eastAsia="Times New Roman" w:hAnsi="Segoe UI" w:cs="Segoe UI"/>
+          <w:color w:val="5A5A5A"/>
+          <w:kern w:val="0"/>
+          <w14:ligatures w14:val="none"/>
+        </w:rPr>
+        <w:drawing>
+          <wp:inline distT="0" distB="0" distL="0" distR="0" wp14:anchorId="2B16E744" wp14:editId="5B97D59E">
+            <wp:extent cx="5943600" cy="2418080"/>
+            <wp:effectExtent l="0" t="0" r="0" b="1270"/>
+            <wp:docPr id="1799025238" name="Picture 1"/>
+            <wp:cNvGraphicFramePr>
+              <a:graphicFrameLocks xmlns:a="http://schemas.openxmlformats.org/drawingml/2006/main" noChangeAspect="1"/>
+            </wp:cNvGraphicFramePr>
+            <a:graphic xmlns:a="http://schemas.openxmlformats.org/drawingml/2006/main">
+              <a:graphicData uri="http://schemas.openxmlformats.org/drawingml/2006/picture">
+                <pic:pic xmlns:pic="http://schemas.openxmlformats.org/drawingml/2006/picture">
+                  <pic:nvPicPr>
+                    <pic:cNvPr id="1799025238" name=""/>
+                    <pic:cNvPicPr/>
+                  </pic:nvPicPr>
+                  <pic:blipFill>
+                    <a:blip r:embed="rId10"/>
+                    <a:stretch>
+                      <a:fillRect/>
+                    </a:stretch>
+                  </pic:blipFill>
+                  <pic:spPr>
+                    <a:xfrm>
+                      <a:off x="0" y="0"/>
+                      <a:ext cx="5943600" cy="2418080"/>
+                    </a:xfrm>
+                    <a:prstGeom prst="rect">
+                      <a:avLst/>
+                    </a:prstGeom>
+                  </pic:spPr>
+                </pic:pic>
+              </a:graphicData>
+            </a:graphic>
+          </wp:inline>
+        </w:drawing>
       </w:r>
     </w:p>
     <w:p>

</xml_diff>